<commit_message>
7.2 Actualiza documentación en Documentación/Documentos
</commit_message>
<xml_diff>
--- a/Documentación/Documentos/plan de calidad-fadebooker.docx
+++ b/Documentación/Documentos/plan de calidad-fadebooker.docx
@@ -85,29 +85,7 @@
           <w:szCs w:val="44"/>
           <w:lang w:val="es-CL"/>
         </w:rPr>
-        <w:t xml:space="preserve">Proyecto:  </w:t>
-      </w:r>
-      <w:proofErr w:type="spellStart"/>
-      <w:r>
-        <w:rPr>
-          <w:i/>
-          <w:iCs/>
-          <w:sz w:val="44"/>
-          <w:szCs w:val="44"/>
-          <w:lang w:val="es-CL"/>
-        </w:rPr>
-        <w:t>FadeBooker</w:t>
-      </w:r>
-      <w:proofErr w:type="spellEnd"/>
-      <w:r>
-        <w:rPr>
-          <w:i/>
-          <w:iCs/>
-          <w:sz w:val="44"/>
-          <w:szCs w:val="44"/>
-          <w:lang w:val="es-CL"/>
-        </w:rPr>
-        <w:t xml:space="preserve"> - Sistema Inteligente de Gestión de Barberías</w:t>
+        <w:t>Proyecto:  FadeBooker - Sistema Inteligente de Gestión de Barberías</w:t>
       </w:r>
     </w:p>
     <w:p>
@@ -344,6 +322,7 @@
         <w:rPr>
           <w:rFonts w:ascii="Arial" w:hAnsi="Arial" w:cs="Arial"/>
           <w:color w:val="000000"/>
+          <w:lang w:val="es-CL"/>
         </w:rPr>
       </w:pPr>
       <w:r>
@@ -363,36 +342,32 @@
       <w:r>
         <w:rPr>
           <w:rFonts w:ascii="Arial" w:hAnsi="Arial" w:cs="Arial"/>
+          <w:lang w:val="es-CL"/>
         </w:rPr>
         <w:t>Fernanda González</w:t>
       </w:r>
       <w:r>
         <w:rPr>
           <w:rFonts w:ascii="Arial" w:hAnsi="Arial" w:cs="Arial"/>
+          <w:lang w:val="es-CL"/>
         </w:rPr>
         <w:br/>
       </w:r>
       <w:r>
         <w:rPr>
           <w:rFonts w:ascii="Arial" w:hAnsi="Arial" w:cs="Arial"/>
+          <w:lang w:val="es-CL"/>
         </w:rPr>
         <w:tab/>
       </w:r>
       <w:r>
         <w:rPr>
           <w:rFonts w:ascii="Arial" w:hAnsi="Arial" w:cs="Arial"/>
+          <w:lang w:val="es-CL"/>
         </w:rPr>
         <w:tab/>
-        <w:t xml:space="preserve">Nicolás </w:t>
-      </w:r>
-      <w:proofErr w:type="spellStart"/>
-      <w:r>
-        <w:rPr>
-          <w:rFonts w:ascii="Arial" w:hAnsi="Arial" w:cs="Arial"/>
-        </w:rPr>
-        <w:t>Vallejos</w:t>
-      </w:r>
-      <w:proofErr w:type="spellEnd"/>
+        <w:t>Nicolás Vallejos</w:t>
+      </w:r>
     </w:p>
     <w:p>
       <w:pPr>
@@ -927,7 +902,6 @@
                 <w:lang w:val="es-CL"/>
               </w:rPr>
             </w:pPr>
-            <w:proofErr w:type="spellStart"/>
             <w:r>
               <w:rPr>
                 <w:rFonts w:ascii="Arial" w:hAnsi="Arial" w:cs="Arial"/>
@@ -935,7 +909,6 @@
               </w:rPr>
               <w:t>Tester</w:t>
             </w:r>
-            <w:proofErr w:type="spellEnd"/>
           </w:p>
         </w:tc>
         <w:tc>
@@ -1169,14 +1142,7 @@
           <w:rFonts w:ascii="Arial" w:hAnsi="Arial" w:cs="Arial"/>
           <w:lang w:val="es-CL"/>
         </w:rPr>
-        <w:t xml:space="preserve">El sistema debe mostrar barberías cercanas según ubicación del </w:t>
-      </w:r>
-      <w:r>
-        <w:rPr>
-          <w:rFonts w:ascii="Arial" w:hAnsi="Arial" w:cs="Arial"/>
-          <w:lang w:val="es-CL"/>
-        </w:rPr>
-        <w:t>cliente.</w:t>
+        <w:t>El sistema debe mostrar barberías cercanas según ubicación del cliente.</w:t>
       </w:r>
     </w:p>
     <w:p>
@@ -1522,23 +1488,7 @@
           <w:rFonts w:ascii="Arial" w:hAnsi="Arial" w:cs="Arial"/>
           <w:lang w:val="es-CL"/>
         </w:rPr>
-        <w:t>Pruebas de integración: Verifican la correcta interacción entre módulos (</w:t>
-      </w:r>
-      <w:proofErr w:type="spellStart"/>
-      <w:r>
-        <w:rPr>
-          <w:rFonts w:ascii="Arial" w:hAnsi="Arial" w:cs="Arial"/>
-          <w:lang w:val="es-CL"/>
-        </w:rPr>
-        <w:t>ej</w:t>
-      </w:r>
-      <w:proofErr w:type="spellEnd"/>
-      <w:r>
-        <w:rPr>
-          <w:rFonts w:ascii="Arial" w:hAnsi="Arial" w:cs="Arial"/>
-          <w:lang w:val="es-CL"/>
-        </w:rPr>
-        <w:t>: pago + agendamiento).</w:t>
+        <w:t>Pruebas de integración: Verifican la correcta interacción entre módulos (ej: pago + agendamiento).</w:t>
       </w:r>
     </w:p>
     <w:p>
@@ -1954,97 +1904,120 @@
         <w:pStyle w:val="Prrafodelista"/>
         <w:numPr>
           <w:ilvl w:val="0"/>
-          <w:numId w:val="6"/>
-        </w:numPr>
-        <w:rPr>
-          <w:rFonts w:ascii="Arial" w:hAnsi="Arial" w:cs="Arial"/>
-          <w:lang w:val="es-CL"/>
-        </w:rPr>
-      </w:pPr>
-      <w:proofErr w:type="spellStart"/>
-      <w:r>
-        <w:rPr>
-          <w:rFonts w:ascii="Arial" w:hAnsi="Arial" w:cs="Arial"/>
-          <w:lang w:val="es-CL"/>
-        </w:rPr>
-        <w:t>Power</w:t>
-      </w:r>
-      <w:proofErr w:type="spellEnd"/>
-      <w:r>
-        <w:rPr>
-          <w:rFonts w:ascii="Arial" w:hAnsi="Arial" w:cs="Arial"/>
-          <w:lang w:val="es-CL"/>
-        </w:rPr>
-        <w:t xml:space="preserve"> Pages: Plataforma de desarrollo utilizada para la creación del sistema</w:t>
-      </w:r>
-    </w:p>
-    <w:p>
-      <w:pPr>
-        <w:pStyle w:val="Prrafodelista"/>
-        <w:numPr>
-          <w:ilvl w:val="0"/>
-          <w:numId w:val="6"/>
-        </w:numPr>
-        <w:rPr>
-          <w:rFonts w:ascii="Arial" w:hAnsi="Arial" w:cs="Arial"/>
-          <w:lang w:val="es-CL"/>
-        </w:rPr>
-      </w:pPr>
-      <w:r>
-        <w:rPr>
-          <w:rFonts w:ascii="Arial" w:hAnsi="Arial" w:cs="Arial"/>
-          <w:lang w:val="es-CL"/>
-        </w:rPr>
-        <w:t>Draw.io: Diseño de diagramas UML y modelos de procesos</w:t>
-      </w:r>
-    </w:p>
-    <w:p>
-      <w:pPr>
-        <w:pStyle w:val="Prrafodelista"/>
-        <w:numPr>
-          <w:ilvl w:val="0"/>
-          <w:numId w:val="6"/>
-        </w:numPr>
-        <w:rPr>
-          <w:rFonts w:ascii="Arial" w:hAnsi="Arial" w:cs="Arial"/>
-          <w:lang w:val="es-CL"/>
-        </w:rPr>
-      </w:pPr>
-      <w:r>
-        <w:rPr>
-          <w:rFonts w:ascii="Arial" w:hAnsi="Arial" w:cs="Arial"/>
-          <w:lang w:val="es-CL"/>
-        </w:rPr>
-        <w:t>Navegadores web: Ejecución de pruebas funcionales</w:t>
-      </w:r>
-    </w:p>
-    <w:p>
-      <w:pPr>
-        <w:pStyle w:val="Prrafodelista"/>
-        <w:numPr>
-          <w:ilvl w:val="0"/>
-          <w:numId w:val="6"/>
-        </w:numPr>
-        <w:rPr>
-          <w:rFonts w:ascii="Arial" w:hAnsi="Arial" w:cs="Arial"/>
-          <w:lang w:val="es-CL"/>
-        </w:rPr>
-      </w:pPr>
-      <w:r>
-        <w:rPr>
-          <w:rFonts w:ascii="Arial" w:hAnsi="Arial" w:cs="Arial"/>
-          <w:lang w:val="es-CL"/>
-        </w:rPr>
-        <w:t>Herramientas de validación: Verificación del correcto funcionamiento del sistema</w:t>
-      </w:r>
-    </w:p>
-    <w:p>
-      <w:pPr>
-        <w:rPr>
-          <w:rFonts w:ascii="Arial" w:hAnsi="Arial" w:cs="Arial"/>
-          <w:lang w:val="es-CL"/>
-        </w:rPr>
-      </w:pPr>
+          <w:numId w:val="7"/>
+        </w:numPr>
+        <w:rPr>
+          <w:rFonts w:ascii="Arial" w:hAnsi="Arial" w:cs="Arial"/>
+          <w:lang w:val="es-CL"/>
+        </w:rPr>
+      </w:pPr>
+      <w:r>
+        <w:rPr>
+          <w:rFonts w:ascii="Arial" w:hAnsi="Arial" w:cs="Arial"/>
+          <w:lang w:val="es-CL"/>
+        </w:rPr>
+        <w:t>React + Vite: Desarrollo del frontend web del sistema.</w:t>
+      </w:r>
+    </w:p>
+    <w:p>
+      <w:pPr>
+        <w:pStyle w:val="Prrafodelista"/>
+        <w:numPr>
+          <w:ilvl w:val="0"/>
+          <w:numId w:val="7"/>
+        </w:numPr>
+        <w:rPr>
+          <w:rFonts w:ascii="Arial" w:hAnsi="Arial" w:cs="Arial"/>
+          <w:lang w:val="es-CL"/>
+        </w:rPr>
+      </w:pPr>
+      <w:r>
+        <w:rPr>
+          <w:rFonts w:ascii="Arial" w:hAnsi="Arial" w:cs="Arial"/>
+          <w:lang w:val="es-CL"/>
+        </w:rPr>
+        <w:t>Node.js + Express: Desarrollo de la API y lógica de negocio.</w:t>
+      </w:r>
+    </w:p>
+    <w:p>
+      <w:pPr>
+        <w:pStyle w:val="Prrafodelista"/>
+        <w:numPr>
+          <w:ilvl w:val="0"/>
+          <w:numId w:val="7"/>
+        </w:numPr>
+        <w:rPr>
+          <w:rFonts w:ascii="Arial" w:hAnsi="Arial" w:cs="Arial"/>
+          <w:lang w:val="es-CL"/>
+        </w:rPr>
+      </w:pPr>
+      <w:r>
+        <w:rPr>
+          <w:rFonts w:ascii="Arial" w:hAnsi="Arial" w:cs="Arial"/>
+          <w:lang w:val="es-CL"/>
+        </w:rPr>
+        <w:t>Azure App Service: Hosting y despliegue cloud del sistema.</w:t>
+      </w:r>
+    </w:p>
+    <w:p>
+      <w:pPr>
+        <w:pStyle w:val="Prrafodelista"/>
+        <w:numPr>
+          <w:ilvl w:val="0"/>
+          <w:numId w:val="7"/>
+        </w:numPr>
+        <w:rPr>
+          <w:rFonts w:ascii="Arial" w:hAnsi="Arial" w:cs="Arial"/>
+          <w:lang w:val="es-CL"/>
+        </w:rPr>
+      </w:pPr>
+      <w:r>
+        <w:rPr>
+          <w:rFonts w:ascii="Arial" w:hAnsi="Arial" w:cs="Arial"/>
+          <w:lang w:val="es-CL"/>
+        </w:rPr>
+        <w:t>Draw.io: Diseño de diagramas UML y modelos de procesos.</w:t>
+      </w:r>
+    </w:p>
+    <w:p>
+      <w:pPr>
+        <w:pStyle w:val="Prrafodelista"/>
+        <w:numPr>
+          <w:ilvl w:val="0"/>
+          <w:numId w:val="7"/>
+        </w:numPr>
+        <w:rPr>
+          <w:rFonts w:ascii="Arial" w:hAnsi="Arial" w:cs="Arial"/>
+          <w:lang w:val="es-CL"/>
+        </w:rPr>
+      </w:pPr>
+      <w:r>
+        <w:rPr>
+          <w:rFonts w:ascii="Arial" w:hAnsi="Arial" w:cs="Arial"/>
+          <w:lang w:val="es-CL"/>
+        </w:rPr>
+        <w:t>Navegadores web: Ejecución de pruebas funcionales.</w:t>
+      </w:r>
+    </w:p>
+    <w:p>
+      <w:pPr>
+        <w:pStyle w:val="Prrafodelista"/>
+        <w:numPr>
+          <w:ilvl w:val="0"/>
+          <w:numId w:val="7"/>
+        </w:numPr>
+        <w:rPr>
+          <w:rFonts w:ascii="Arial" w:hAnsi="Arial" w:cs="Arial"/>
+          <w:lang w:val="es-CL"/>
+        </w:rPr>
+      </w:pPr>
+      <w:r>
+        <w:rPr>
+          <w:rFonts w:ascii="Arial" w:hAnsi="Arial" w:cs="Arial"/>
+          <w:lang w:val="es-CL"/>
+        </w:rPr>
+        <w:t>Herramientas de validación: Verificación del correcto funcionamiento del sistema.</w:t>
+      </w:r>
     </w:p>
     <w:p>
       <w:pPr>
@@ -2118,23 +2091,7 @@
           <w:rFonts w:ascii="Arial" w:hAnsi="Arial" w:cs="Arial"/>
           <w:lang w:val="es-CL"/>
         </w:rPr>
-        <w:t xml:space="preserve">El presente Plan de Calidad establece los lineamientos necesarios para asegurar el correcto desarrollo y funcionamiento del sistema </w:t>
-      </w:r>
-      <w:proofErr w:type="spellStart"/>
-      <w:r>
-        <w:rPr>
-          <w:rFonts w:ascii="Arial" w:hAnsi="Arial" w:cs="Arial"/>
-          <w:lang w:val="es-CL"/>
-        </w:rPr>
-        <w:t>FadeBooker</w:t>
-      </w:r>
-      <w:proofErr w:type="spellEnd"/>
-      <w:r>
-        <w:rPr>
-          <w:rFonts w:ascii="Arial" w:hAnsi="Arial" w:cs="Arial"/>
-          <w:lang w:val="es-CL"/>
-        </w:rPr>
-        <w:t>. A través de la definición de estándares, estrategias de prueba y criterios de aceptación, se busca garantizar que la plataforma cumpla con los requerimientos establecidos y entregue una experiencia confiable a los usuarios.</w:t>
+        <w:t>El presente Plan de Calidad establece los lineamientos necesarios para asegurar el correcto desarrollo y funcionamiento del sistema FadeBooker. A través de la definición de estándares, estrategias de prueba y criterios de aceptación, se busca garantizar que la plataforma cumpla con los requerimientos establecidos y entregue una experiencia confiable a los usuarios.</w:t>
       </w:r>
     </w:p>
     <w:p>
@@ -2730,6 +2687,119 @@
     </w:lvl>
   </w:abstractNum>
   <w:abstractNum w:abstractNumId="5" w15:restartNumberingAfterBreak="0">
+    <w:nsid w:val="6CE5499C"/>
+    <w:multiLevelType w:val="hybridMultilevel"/>
+    <w:tmpl w:val="5DE8F992"/>
+    <w:lvl w:ilvl="0" w:tplc="04090001">
+      <w:start w:val="1"/>
+      <w:numFmt w:val="bullet"/>
+      <w:lvlText w:val=""/>
+      <w:lvlJc w:val="left"/>
+      <w:pPr>
+        <w:ind w:left="720" w:hanging="360"/>
+      </w:pPr>
+      <w:rPr>
+        <w:rFonts w:ascii="Symbol" w:hAnsi="Symbol" w:hint="default"/>
+      </w:rPr>
+    </w:lvl>
+    <w:lvl w:ilvl="1" w:tplc="04090003" w:tentative="1">
+      <w:start w:val="1"/>
+      <w:numFmt w:val="bullet"/>
+      <w:lvlText w:val="o"/>
+      <w:lvlJc w:val="left"/>
+      <w:pPr>
+        <w:ind w:left="1440" w:hanging="360"/>
+      </w:pPr>
+      <w:rPr>
+        <w:rFonts w:ascii="Courier New" w:hAnsi="Courier New" w:cs="Courier New" w:hint="default"/>
+      </w:rPr>
+    </w:lvl>
+    <w:lvl w:ilvl="2" w:tplc="04090005" w:tentative="1">
+      <w:start w:val="1"/>
+      <w:numFmt w:val="bullet"/>
+      <w:lvlText w:val=""/>
+      <w:lvlJc w:val="left"/>
+      <w:pPr>
+        <w:ind w:left="2160" w:hanging="360"/>
+      </w:pPr>
+      <w:rPr>
+        <w:rFonts w:ascii="Wingdings" w:hAnsi="Wingdings" w:hint="default"/>
+      </w:rPr>
+    </w:lvl>
+    <w:lvl w:ilvl="3" w:tplc="04090001" w:tentative="1">
+      <w:start w:val="1"/>
+      <w:numFmt w:val="bullet"/>
+      <w:lvlText w:val=""/>
+      <w:lvlJc w:val="left"/>
+      <w:pPr>
+        <w:ind w:left="2880" w:hanging="360"/>
+      </w:pPr>
+      <w:rPr>
+        <w:rFonts w:ascii="Symbol" w:hAnsi="Symbol" w:hint="default"/>
+      </w:rPr>
+    </w:lvl>
+    <w:lvl w:ilvl="4" w:tplc="04090003" w:tentative="1">
+      <w:start w:val="1"/>
+      <w:numFmt w:val="bullet"/>
+      <w:lvlText w:val="o"/>
+      <w:lvlJc w:val="left"/>
+      <w:pPr>
+        <w:ind w:left="3600" w:hanging="360"/>
+      </w:pPr>
+      <w:rPr>
+        <w:rFonts w:ascii="Courier New" w:hAnsi="Courier New" w:cs="Courier New" w:hint="default"/>
+      </w:rPr>
+    </w:lvl>
+    <w:lvl w:ilvl="5" w:tplc="04090005" w:tentative="1">
+      <w:start w:val="1"/>
+      <w:numFmt w:val="bullet"/>
+      <w:lvlText w:val=""/>
+      <w:lvlJc w:val="left"/>
+      <w:pPr>
+        <w:ind w:left="4320" w:hanging="360"/>
+      </w:pPr>
+      <w:rPr>
+        <w:rFonts w:ascii="Wingdings" w:hAnsi="Wingdings" w:hint="default"/>
+      </w:rPr>
+    </w:lvl>
+    <w:lvl w:ilvl="6" w:tplc="04090001" w:tentative="1">
+      <w:start w:val="1"/>
+      <w:numFmt w:val="bullet"/>
+      <w:lvlText w:val=""/>
+      <w:lvlJc w:val="left"/>
+      <w:pPr>
+        <w:ind w:left="5040" w:hanging="360"/>
+      </w:pPr>
+      <w:rPr>
+        <w:rFonts w:ascii="Symbol" w:hAnsi="Symbol" w:hint="default"/>
+      </w:rPr>
+    </w:lvl>
+    <w:lvl w:ilvl="7" w:tplc="04090003" w:tentative="1">
+      <w:start w:val="1"/>
+      <w:numFmt w:val="bullet"/>
+      <w:lvlText w:val="o"/>
+      <w:lvlJc w:val="left"/>
+      <w:pPr>
+        <w:ind w:left="5760" w:hanging="360"/>
+      </w:pPr>
+      <w:rPr>
+        <w:rFonts w:ascii="Courier New" w:hAnsi="Courier New" w:cs="Courier New" w:hint="default"/>
+      </w:rPr>
+    </w:lvl>
+    <w:lvl w:ilvl="8" w:tplc="04090005" w:tentative="1">
+      <w:start w:val="1"/>
+      <w:numFmt w:val="bullet"/>
+      <w:lvlText w:val=""/>
+      <w:lvlJc w:val="left"/>
+      <w:pPr>
+        <w:ind w:left="6480" w:hanging="360"/>
+      </w:pPr>
+      <w:rPr>
+        <w:rFonts w:ascii="Wingdings" w:hAnsi="Wingdings" w:hint="default"/>
+      </w:rPr>
+    </w:lvl>
+  </w:abstractNum>
+  <w:abstractNum w:abstractNumId="6" w15:restartNumberingAfterBreak="0">
     <w:nsid w:val="730B36EA"/>
     <w:multiLevelType w:val="hybridMultilevel"/>
     <w:tmpl w:val="CE66B9AA"/>
@@ -2849,7 +2919,7 @@
     <w:abstractNumId w:val="4"/>
   </w:num>
   <w:num w:numId="3">
-    <w:abstractNumId w:val="5"/>
+    <w:abstractNumId w:val="6"/>
   </w:num>
   <w:num w:numId="4">
     <w:abstractNumId w:val="1"/>
@@ -2859,6 +2929,9 @@
   </w:num>
   <w:num w:numId="6">
     <w:abstractNumId w:val="0"/>
+  </w:num>
+  <w:num w:numId="7">
+    <w:abstractNumId w:val="5"/>
   </w:num>
 </w:numbering>
 </file>

</xml_diff>